<commit_message>
Polish service layout and update clickable CV
</commit_message>
<xml_diff>
--- a/documents/thomas-ogun-visual-arts-cv.docx
+++ b/documents/thomas-ogun-visual-arts-cv.docx
@@ -23,8 +23,33 @@
         <w:pStyle w:val="CVMeta"/>
       </w:pPr>
       <w:r>
-        <w:t>Nigeria  |  thomasogunvisuals.com  |  bookings@thomasogunvisuals.com</w:t>
+        <w:t xml:space="preserve">Nigeria  |  </w:t>
       </w:r>
+      <w:hyperlink r:id="rId11">
+        <w:r>
+          <w:rPr>
+            <w:rFonts w:ascii="Helvetica Neue" w:hAnsi="Helvetica Neue"/>
+            <w:sz w:val="17"/>
+            <w:color w:val="555555"/>
+            <w:u w:val="single"/>
+          </w:rPr>
+          <w:t>thomasogunvisuals.com</w:t>
+        </w:r>
+      </w:hyperlink>
+      <w:r>
+        <w:t xml:space="preserve">  |  </w:t>
+      </w:r>
+      <w:hyperlink r:id="rId12">
+        <w:r>
+          <w:rPr>
+            <w:rFonts w:ascii="Helvetica Neue" w:hAnsi="Helvetica Neue"/>
+            <w:sz w:val="17"/>
+            <w:color w:val="555555"/>
+            <w:u w:val="single"/>
+          </w:rPr>
+          <w:t>bookings@thomasogunvisuals.com</w:t>
+        </w:r>
+      </w:hyperlink>
     </w:p>
     <w:p>
       <w:pPr>
@@ -422,7 +447,7 @@
     </w:p>
     <w:p>
       <w:r>
-        <w:t>Digital illustration; graphite drawing; moving image; cinematography; editing; sound; augmented reality; Unity; Vuforia; creative direction; visual systems; exhibition and project development.</w:t>
+        <w:t>Creative Direction • Visual Systems • Digital Illustration • Graphite Drawing • Moving Image • Cinematography • Video Editing • Sound Design • Augmented Reality • Interactive Media • Exhibition Development • Project Development</w:t>
       </w:r>
     </w:p>
     <w:p>
@@ -444,9 +469,17 @@
         </w:rPr>
         <w:t xml:space="preserve">Artist website: </w:t>
       </w:r>
-      <w:r>
-        <w:t>https://thomasogunvisuals.com/</w:t>
-      </w:r>
+      <w:hyperlink r:id="rId11">
+        <w:r>
+          <w:rPr>
+            <w:rFonts w:ascii="Helvetica Neue" w:hAnsi="Helvetica Neue"/>
+            <w:sz w:val="20"/>
+            <w:color w:val="555555"/>
+            <w:u w:val="single"/>
+          </w:rPr>
+          <w:t>https://thomasogunvisuals.com/</w:t>
+        </w:r>
+      </w:hyperlink>
     </w:p>
     <w:p>
       <w:pPr>
@@ -458,9 +491,17 @@
         </w:rPr>
         <w:t xml:space="preserve">Exhibition project: </w:t>
       </w:r>
-      <w:r>
-        <w:t>https://thomasogunvisuals.com/exhibition.html</w:t>
-      </w:r>
+      <w:hyperlink r:id="rId13">
+        <w:r>
+          <w:rPr>
+            <w:rFonts w:ascii="Helvetica Neue" w:hAnsi="Helvetica Neue"/>
+            <w:sz w:val="20"/>
+            <w:color w:val="555555"/>
+            <w:u w:val="single"/>
+          </w:rPr>
+          <w:t>https://thomasogunvisuals.com/exhibition.html</w:t>
+        </w:r>
+      </w:hyperlink>
     </w:p>
     <w:p>
       <w:pPr>
@@ -472,9 +513,17 @@
         </w:rPr>
         <w:t xml:space="preserve">Online catalogue: </w:t>
       </w:r>
-      <w:r>
-        <w:t>https://thomasogunvisuals.com/exhibition-catalogue.html</w:t>
-      </w:r>
+      <w:hyperlink r:id="rId14">
+        <w:r>
+          <w:rPr>
+            <w:rFonts w:ascii="Helvetica Neue" w:hAnsi="Helvetica Neue"/>
+            <w:sz w:val="20"/>
+            <w:color w:val="555555"/>
+            <w:u w:val="single"/>
+          </w:rPr>
+          <w:t>https://thomasogunvisuals.com/exhibition-catalogue.html</w:t>
+        </w:r>
+      </w:hyperlink>
     </w:p>
     <w:p>
       <w:pPr>
@@ -486,9 +535,17 @@
         </w:rPr>
         <w:t xml:space="preserve">Professional practice: </w:t>
       </w:r>
-      <w:r>
-        <w:t>https://thomasogunvisuals.com/professional-practice.html</w:t>
-      </w:r>
+      <w:hyperlink r:id="rId15">
+        <w:r>
+          <w:rPr>
+            <w:rFonts w:ascii="Helvetica Neue" w:hAnsi="Helvetica Neue"/>
+            <w:sz w:val="20"/>
+            <w:color w:val="555555"/>
+            <w:u w:val="single"/>
+          </w:rPr>
+          <w:t>https://thomasogunvisuals.com/professional-practice.html</w:t>
+        </w:r>
+      </w:hyperlink>
     </w:p>
     <w:p>
       <w:pPr>
@@ -500,9 +557,17 @@
         </w:rPr>
         <w:t xml:space="preserve">Press and curatorial information: </w:t>
       </w:r>
-      <w:r>
-        <w:t>https://thomasogunvisuals.com/press.html</w:t>
-      </w:r>
+      <w:hyperlink r:id="rId16">
+        <w:r>
+          <w:rPr>
+            <w:rFonts w:ascii="Helvetica Neue" w:hAnsi="Helvetica Neue"/>
+            <w:sz w:val="20"/>
+            <w:color w:val="555555"/>
+            <w:u w:val="single"/>
+          </w:rPr>
+          <w:t>https://thomasogunvisuals.com/press.html</w:t>
+        </w:r>
+      </w:hyperlink>
     </w:p>
     <w:sectPr>
       <w:headerReference w:type="default" r:id="rId9"/>
@@ -550,8 +615,19 @@
               <w:color w:val="555555"/>
               <w:sz w:val="15"/>
             </w:rPr>
-            <w:t>Portfolio: thomasogunvisuals.com/exhibition.html</w:t>
+            <w:t xml:space="preserve">Portfolio: </w:t>
           </w:r>
+          <w:hyperlink r:id="rId1">
+            <w:r>
+              <w:rPr>
+                <w:rFonts w:ascii="Helvetica Neue" w:hAnsi="Helvetica Neue"/>
+                <w:sz w:val="15"/>
+                <w:color w:val="555555"/>
+                <w:u w:val="single"/>
+              </w:rPr>
+              <w:t>thomasogunvisuals.com/exhibition.html</w:t>
+            </w:r>
+          </w:hyperlink>
         </w:p>
       </w:tc>
       <w:tc>
@@ -587,40 +663,42 @@
           <w:pPr>
             <w:jc w:val="right"/>
           </w:pPr>
-          <w:r>
-            <w:drawing>
-              <wp:inline xmlns:a="http://schemas.openxmlformats.org/drawingml/2006/main" xmlns:pic="http://schemas.openxmlformats.org/drawingml/2006/picture">
-                <wp:extent cx="438912" cy="438912"/>
-                <wp:docPr id="1" name="Picture 1"/>
-                <wp:cNvGraphicFramePr>
-                  <a:graphicFrameLocks noChangeAspect="1"/>
-                </wp:cNvGraphicFramePr>
-                <a:graphic>
-                  <a:graphicData uri="http://schemas.openxmlformats.org/drawingml/2006/picture">
-                    <pic:pic>
-                      <pic:nvPicPr>
-                        <pic:cNvPr id="0" name=".cv-portfolio-qr.png"/>
-                        <pic:cNvPicPr/>
-                      </pic:nvPicPr>
-                      <pic:blipFill>
-                        <a:blip r:embed="rId1"/>
-                        <a:stretch>
-                          <a:fillRect/>
-                        </a:stretch>
-                      </pic:blipFill>
-                      <pic:spPr>
-                        <a:xfrm>
-                          <a:off x="0" y="0"/>
-                          <a:ext cx="438912" cy="438912"/>
-                        </a:xfrm>
-                        <a:prstGeom prst="rect"/>
-                      </pic:spPr>
-                    </pic:pic>
-                  </a:graphicData>
-                </a:graphic>
-              </wp:inline>
-            </w:drawing>
-          </w:r>
+          <w:hyperlink r:id="rId1">
+            <w:r>
+              <w:drawing>
+                <wp:inline xmlns:a="http://schemas.openxmlformats.org/drawingml/2006/main" xmlns:pic="http://schemas.openxmlformats.org/drawingml/2006/picture">
+                  <wp:extent cx="566928" cy="566928"/>
+                  <wp:docPr id="1" name="Picture 1"/>
+                  <wp:cNvGraphicFramePr>
+                    <a:graphicFrameLocks noChangeAspect="1"/>
+                  </wp:cNvGraphicFramePr>
+                  <a:graphic>
+                    <a:graphicData uri="http://schemas.openxmlformats.org/drawingml/2006/picture">
+                      <pic:pic>
+                        <pic:nvPicPr>
+                          <pic:cNvPr id="0" name=".cv-portfolio-qr.png"/>
+                          <pic:cNvPicPr/>
+                        </pic:nvPicPr>
+                        <pic:blipFill>
+                          <a:blip r:embed="rId2"/>
+                          <a:stretch>
+                            <a:fillRect/>
+                          </a:stretch>
+                        </pic:blipFill>
+                        <pic:spPr>
+                          <a:xfrm>
+                            <a:off x="0" y="0"/>
+                            <a:ext cx="566928" cy="566928"/>
+                          </a:xfrm>
+                          <a:prstGeom prst="rect"/>
+                        </pic:spPr>
+                      </pic:pic>
+                    </a:graphicData>
+                  </a:graphic>
+                </wp:inline>
+              </w:drawing>
+            </w:r>
+          </w:hyperlink>
         </w:p>
       </w:tc>
     </w:tr>

</xml_diff>

<commit_message>
Publish updated Thomas Ogun Visuals portfolio
</commit_message>
<xml_diff>
--- a/documents/thomas-ogun-visual-arts-cv.docx
+++ b/documents/thomas-ogun-visual-arts-cv.docx
@@ -15,7 +15,7 @@
         <w:pStyle w:val="CVSubtitle"/>
       </w:pPr>
       <w:r>
-        <w:t>INTERDISCIPLINARY VISUAL ARTIST</w:t>
+        <w:t>NIGERIAN VISUAL ARTIST | INTERDISCIPLINARY PRACTICE</w:t>
       </w:r>
     </w:p>
     <w:p>
@@ -23,7 +23,7 @@
         <w:pStyle w:val="CVMeta"/>
       </w:pPr>
       <w:r>
-        <w:t xml:space="preserve">Nigeria  |  </w:t>
+        <w:t xml:space="preserve">Nigerian visual artist  |  </w:t>
       </w:r>
       <w:hyperlink r:id="rId11">
         <w:r>
@@ -47,7 +47,7 @@
             <w:color w:val="555555"/>
             <w:u w:val="single"/>
           </w:rPr>
-          <w:t>bookings@thomasogunvisuals.com</w:t>
+          <w:t>contact@thomasogunvisuals.com</w:t>
         </w:r>
       </w:hyperlink>
     </w:p>
@@ -86,7 +86,7 @@
           <w:b/>
           <w:color w:val="242424"/>
         </w:rPr>
-        <w:t>Identity &amp; Spirituality - independent exhibition project</w:t>
+        <w:t>Identity &amp; Spirituality - Self-curated Exhibition</w:t>
       </w:r>
       <w:r>
         <w:tab/>
@@ -104,7 +104,7 @@
         <w:pStyle w:val="CVDetail"/>
       </w:pPr>
       <w:r>
-        <w:t>Artist and project lead. A ten-work visual arts project comprising eight physical digital illustrations and two augmented reality installations. The project examines ancestry, memory, belief and cultural continuity through image, movement and sound.</w:t>
+        <w:t>Artist, curator and project lead. A ten-work exhibition comprising eight physical digital illustrations and two augmented reality installations. The exhibition examines ancestry, memory, belief and cultural continuity through image, movement and sound.</w:t>
       </w:r>
     </w:p>
     <w:p>
@@ -467,7 +467,7 @@
         <w:rPr>
           <w:b/>
         </w:rPr>
-        <w:t xml:space="preserve">Artist website: </w:t>
+        <w:t xml:space="preserve">Website: </w:t>
       </w:r>
       <w:hyperlink r:id="rId11">
         <w:r>
@@ -489,7 +489,7 @@
         <w:rPr>
           <w:b/>
         </w:rPr>
-        <w:t xml:space="preserve">Exhibition project: </w:t>
+        <w:t xml:space="preserve">Exhibition: </w:t>
       </w:r>
       <w:hyperlink r:id="rId13">
         <w:r>
@@ -511,7 +511,7 @@
         <w:rPr>
           <w:b/>
         </w:rPr>
-        <w:t xml:space="preserve">Online catalogue: </w:t>
+        <w:t xml:space="preserve">Catalogue: </w:t>
       </w:r>
       <w:hyperlink r:id="rId14">
         <w:r>

</xml_diff>